<commit_message>
Dozenten-Anmerkungen umgesetzt: Gruppe/2016 auf Folie 1, Stakeholder, Lizenzen, Störinfos, Länder
- Folie 1: Gruppenfeld, gescheitertes Projekt 2016
- Folie 5: Tabelle 'Was die Empfehlung für Sie bedeutet', Sprechernotizen
- Anhang A7-A10: Longlist komplett, Lizenzmodelle, Störinformationen, Länder/Recht
- XLSX Blätter 11-14, TCO in Logik des Projektauftrags, Vollkosten je Nutzer

Co-Authored-By: Claude Opus 5.5 <noreply@anthropic.com>
Claude-Session: https://claude.ai/code/session_01VgMudMW5WnZtVuJXfg3nuQ
</commit_message>
<xml_diff>
--- a/Abgabe/KVA_ERP2028_KI-Nutzungsprotokoll.docx
+++ b/Abgabe/KVA_ERP2028_KI-Nutzungsprotokoll.docx
@@ -136,6 +136,28 @@
           <w:p>
             <w:r>
               <w:t>Widerspruchsliste, Klassifizierung aller 111 Anforderungen, Longlist/Shortlist, NWA, TCO, Folien</w:t>
+            </w:r>
+          </w:p>
+        </w:tc>
+      </w:tr>
+      <w:tr>
+        <w:tc>
+          <w:tcPr>
+            <w:tcW w:type="dxa" w:w="5100"/>
+          </w:tcPr>
+          <w:p>
+            <w:r>
+              <w:t>Anmerkungen des Dozenten (Name/Matrikelnr., gescheitertes Projekt, Störinfos, Lizenzen, Longlist/Shortlist für Rückfragen, Gesamtkosten, Management abholen, EU-Ausland/Budget)</w:t>
+            </w:r>
+          </w:p>
+        </w:tc>
+        <w:tc>
+          <w:tcPr>
+            <w:tcW w:type="dxa" w:w="5100"/>
+          </w:tcPr>
+          <w:p>
+            <w:r>
+              <w:t>Ergänzt: Folie 1 (2016, Gruppe), Stakeholder-Tabelle Folie 5, Anhang A7–A10, Blätter 11–14, Sprechernotizen</w:t>
             </w:r>
           </w:p>
         </w:tc>

</xml_diff>

<commit_message>
Version 2: beste Inhalte aus beiden Gruppenversionen und Vorlesung zusammengeführt
- Shortlist korrigiert: BC, proALPHA, IFS, abas (CZ-Partner per Quelle geprüft), APplus Nachrücker
- Kriterium Multi-Site vs. Mehrmandanten nach Vorlesung, Kostenspannen, BC-Preise in EUR
- Testskript T1-T6, nummerierte Quellen S01-S23

Co-Authored-By: Claude Opus 5.5 <noreply@anthropic.com>
Claude-Session: https://claude.ai/code/session_01VgMudMW5WnZtVuJXfg3nuQ
</commit_message>
<xml_diff>
--- a/Abgabe/KVA_ERP2028_KI-Nutzungsprotokoll.docx
+++ b/Abgabe/KVA_ERP2028_KI-Nutzungsprotokoll.docx
@@ -147,6 +147,28 @@
           </w:tcPr>
           <w:p>
             <w:r>
+              <w:t>„Fasse das Beste aus beiden Versionen zusammen“ + Vorlesungsfolien Teil 1/2</w:t>
+            </w:r>
+          </w:p>
+        </w:tc>
+        <w:tc>
+          <w:tcPr>
+            <w:tcW w:type="dxa" w:w="5100"/>
+          </w:tcPr>
+          <w:p>
+            <w:r>
+              <w:t>Quellen der Gruppenversion geprüft, Shortlist korrigiert, Testskript, Kostenspannen, nummerierte Quellen, Kriterium Multi-Site</w:t>
+            </w:r>
+          </w:p>
+        </w:tc>
+      </w:tr>
+      <w:tr>
+        <w:tc>
+          <w:tcPr>
+            <w:tcW w:type="dxa" w:w="5100"/>
+          </w:tcPr>
+          <w:p>
+            <w:r>
               <w:t>Anmerkungen des Dozenten (Name/Matrikelnr., gescheitertes Projekt, Störinfos, Lizenzen, Longlist/Shortlist für Rückfragen, Gesamtkosten, Management abholen, EU-Ausland/Budget)</w:t>
             </w:r>
           </w:p>
@@ -224,7 +246,7 @@
         <w:pStyle w:val="ListBullet"/>
       </w:pPr>
       <w:r>
-        <w:t>Herstellerangaben: per Websuche geprüft. Bestätigt: CZ-Lokalisierung Business Central (Microsoft Learn), BC-Preise ab 11/2025 (nur USD-Sekundärquellen), IFS-Partner in CZ, SAP-KBA zu fehlendem E-Invoicing CZ. NICHT bestätigt: CZ-Präsenz von proALPHA/abas, CZ-Lokalisierung von APplus → als „offen/im RFI prüfen“ markiert statt als Fakt.</w:t>
+        <w:t>Herstellerangaben: per Websuche geprüft. Bestätigt: CZ-Lokalisierung Business Central (Microsoft Learn), BC-Preise ab 11/2025 (nur USD-Sekundärquellen), IFS-Partner in CZ, SAP-KBA zu fehlendem E-Invoicing CZ. Abgleich mit einer zweiten, mit ChatGPT erstellten Gruppenversion: deren Quellen geprüft → CZ-Partner von proALPHA (SPC solutions), abas (amotIQ) und Infor (ITeuro) bestätigt; unsere Longlist hatte sie fälschlich als „nicht belegt“ geführt und wurde korrigiert (Shortlist jetzt BC, proALPHA, IFS, abas). NICHT belegt: APplus-Partner in CZ → Nachrücker.</w:t>
       </w:r>
     </w:p>
     <w:p>
@@ -240,7 +262,15 @@
         <w:pStyle w:val="ListBullet"/>
       </w:pPr>
       <w:r>
-        <w:t>Preise APplus/IFS sind nicht öffentlich: alle Werte als ANNAHME (gelb) gekennzeichnet; keine von der KI „erfundenen“ Listenpreise.</w:t>
+        <w:t>BC-Preise auf die Euro-Werte der Microsoft-Preisseite umgestellt (vorher aus USD umgerechnet). Preise proALPHA/IFS/abas sind nicht öffentlich: als ANNAHME (gelb) mit Spanne −15 %/+35 % gekennzeichnet.</w:t>
+      </w:r>
+    </w:p>
+    <w:p>
+      <w:pPr>
+        <w:pStyle w:val="ListBullet"/>
+      </w:pPr>
+      <w:r>
+        <w:t>Vorlesungsfolien (Kurz 2026; Martin/Kurz 2024) eingearbeitet: Kriterium Multi-Site vs. Mehrmandanten; keine Marktanteilsstudien genutzt („Datenquellen meist zweifelhaft“).</w:t>
       </w:r>
     </w:p>
     <w:p>

</xml_diff>